<commit_message>
Updated interview Questions in Java
</commit_message>
<xml_diff>
--- a/JAVA_INT.docx
+++ b/JAVA_INT.docx
@@ -18,19 +18,8 @@
           <w:sz w:val="40"/>
           <w:szCs w:val="40"/>
         </w:rPr>
-        <w:t xml:space="preserve">Core </w:t>
-      </w:r>
-      <w:proofErr w:type="gramStart"/>
-      <w:r>
-        <w:rPr>
-          <w:b/>
-          <w:bCs/>
-          <w:sz w:val="40"/>
-          <w:szCs w:val="40"/>
-        </w:rPr>
-        <w:t>Java :</w:t>
-      </w:r>
-      <w:proofErr w:type="gramEnd"/>
+        <w:t>Core Java :</w:t>
+      </w:r>
     </w:p>
     <w:p>
       <w:pPr>
@@ -86,49 +75,27 @@
           <w:sz w:val="28"/>
           <w:szCs w:val="28"/>
         </w:rPr>
-        <w:t xml:space="preserve">3)What are data types in </w:t>
-      </w:r>
-      <w:proofErr w:type="gramStart"/>
-      <w:r>
-        <w:rPr>
-          <w:b/>
-          <w:bCs/>
-          <w:sz w:val="28"/>
-          <w:szCs w:val="28"/>
-        </w:rPr>
-        <w:t>Java ?</w:t>
-      </w:r>
-      <w:proofErr w:type="gramEnd"/>
-    </w:p>
-    <w:p>
-      <w:pPr>
-        <w:rPr>
-          <w:b/>
-          <w:bCs/>
-          <w:sz w:val="28"/>
-          <w:szCs w:val="28"/>
-        </w:rPr>
-      </w:pPr>
-      <w:r>
-        <w:rPr>
-          <w:b/>
-          <w:bCs/>
-          <w:sz w:val="28"/>
-          <w:szCs w:val="28"/>
-        </w:rPr>
-        <w:t xml:space="preserve">4) How do you find the Range of a specific data type in </w:t>
-      </w:r>
-      <w:proofErr w:type="gramStart"/>
-      <w:r>
-        <w:rPr>
-          <w:b/>
-          <w:bCs/>
-          <w:sz w:val="28"/>
-          <w:szCs w:val="28"/>
-        </w:rPr>
-        <w:t>java ?</w:t>
-      </w:r>
-      <w:proofErr w:type="gramEnd"/>
+        <w:t>3)What are data types in Java ?</w:t>
+      </w:r>
+    </w:p>
+    <w:p>
+      <w:pPr>
+        <w:rPr>
+          <w:b/>
+          <w:bCs/>
+          <w:sz w:val="28"/>
+          <w:szCs w:val="28"/>
+        </w:rPr>
+      </w:pPr>
+      <w:r>
+        <w:rPr>
+          <w:b/>
+          <w:bCs/>
+          <w:sz w:val="28"/>
+          <w:szCs w:val="28"/>
+        </w:rPr>
+        <w:t>4) How do you find the Range of a specific data type in java ?</w:t>
+      </w:r>
     </w:p>
     <w:p>
       <w:pPr>
@@ -222,66 +189,35 @@
           <w:sz w:val="28"/>
           <w:szCs w:val="28"/>
         </w:rPr>
-        <w:t xml:space="preserve">9)what are the conditional statements in </w:t>
-      </w:r>
-      <w:proofErr w:type="gramStart"/>
-      <w:r>
-        <w:rPr>
-          <w:b/>
-          <w:bCs/>
-          <w:sz w:val="28"/>
-          <w:szCs w:val="28"/>
-        </w:rPr>
-        <w:t>java ?</w:t>
-      </w:r>
-      <w:proofErr w:type="gramEnd"/>
-    </w:p>
-    <w:p>
-      <w:pPr>
-        <w:rPr>
-          <w:b/>
-          <w:bCs/>
-          <w:sz w:val="28"/>
-          <w:szCs w:val="28"/>
-        </w:rPr>
-      </w:pPr>
-      <w:r>
-        <w:rPr>
-          <w:b/>
-          <w:bCs/>
-          <w:sz w:val="28"/>
-          <w:szCs w:val="28"/>
-        </w:rPr>
-        <w:t xml:space="preserve">10)Give the different account of the </w:t>
-      </w:r>
-      <w:proofErr w:type="gramStart"/>
-      <w:r>
-        <w:rPr>
-          <w:b/>
-          <w:bCs/>
-          <w:sz w:val="28"/>
-          <w:szCs w:val="28"/>
-        </w:rPr>
-        <w:t xml:space="preserve">logical  </w:t>
-      </w:r>
-      <w:r>
-        <w:rPr>
-          <w:b/>
-          <w:bCs/>
-          <w:sz w:val="28"/>
-          <w:szCs w:val="28"/>
-        </w:rPr>
-        <w:t>operators</w:t>
-      </w:r>
-      <w:proofErr w:type="gramEnd"/>
-      <w:r>
-        <w:rPr>
-          <w:b/>
-          <w:bCs/>
-          <w:sz w:val="28"/>
-          <w:szCs w:val="28"/>
-        </w:rPr>
-        <w:t xml:space="preserve"> in java.</w:t>
+        <w:t>9)what are the conditional statements in java ?</w:t>
+      </w:r>
+    </w:p>
+    <w:p>
+      <w:pPr>
+        <w:rPr>
+          <w:b/>
+          <w:bCs/>
+          <w:sz w:val="28"/>
+          <w:szCs w:val="28"/>
+        </w:rPr>
+      </w:pPr>
+      <w:r>
+        <w:rPr>
+          <w:b/>
+          <w:bCs/>
+          <w:sz w:val="28"/>
+          <w:szCs w:val="28"/>
+        </w:rPr>
+        <w:t xml:space="preserve">10)Give the different account of the logical  </w:t>
+      </w:r>
+      <w:r>
+        <w:rPr>
+          <w:b/>
+          <w:bCs/>
+          <w:sz w:val="28"/>
+          <w:szCs w:val="28"/>
+        </w:rPr>
+        <w:t>operators in java.</w:t>
       </w:r>
     </w:p>
     <w:p>
@@ -320,117 +256,55 @@
           <w:sz w:val="28"/>
           <w:szCs w:val="28"/>
         </w:rPr>
-        <w:t xml:space="preserve"> </w:t>
-      </w:r>
-      <w:proofErr w:type="gramStart"/>
-      <w:r>
-        <w:rPr>
-          <w:b/>
-          <w:bCs/>
-          <w:sz w:val="28"/>
-          <w:szCs w:val="28"/>
-        </w:rPr>
-        <w:t xml:space="preserve">of </w:t>
-      </w:r>
-      <w:r>
-        <w:rPr>
-          <w:b/>
-          <w:bCs/>
-          <w:sz w:val="28"/>
-          <w:szCs w:val="28"/>
-        </w:rPr>
-        <w:t xml:space="preserve"> =</w:t>
-      </w:r>
-      <w:proofErr w:type="gramEnd"/>
-      <w:r>
-        <w:rPr>
-          <w:b/>
-          <w:bCs/>
-          <w:sz w:val="28"/>
-          <w:szCs w:val="28"/>
-        </w:rPr>
-        <w:t xml:space="preserve">= </w:t>
-      </w:r>
-      <w:proofErr w:type="gramStart"/>
-      <w:r>
-        <w:rPr>
-          <w:b/>
-          <w:bCs/>
-          <w:sz w:val="28"/>
-          <w:szCs w:val="28"/>
-        </w:rPr>
-        <w:t>and .equals</w:t>
-      </w:r>
-      <w:proofErr w:type="gramEnd"/>
-      <w:r>
-        <w:rPr>
-          <w:b/>
-          <w:bCs/>
-          <w:sz w:val="28"/>
-          <w:szCs w:val="28"/>
-        </w:rPr>
-        <w:t>() in Java?</w:t>
-      </w:r>
-    </w:p>
-    <w:p>
-      <w:pPr>
-        <w:rPr>
-          <w:b/>
-          <w:bCs/>
-          <w:sz w:val="28"/>
-          <w:szCs w:val="28"/>
-        </w:rPr>
-      </w:pPr>
-      <w:r>
-        <w:rPr>
-          <w:b/>
-          <w:bCs/>
-          <w:sz w:val="28"/>
-          <w:szCs w:val="28"/>
-        </w:rPr>
-        <w:t xml:space="preserve">12)what is </w:t>
-      </w:r>
-      <w:proofErr w:type="gramStart"/>
-      <w:r>
-        <w:rPr>
-          <w:b/>
-          <w:bCs/>
-          <w:sz w:val="28"/>
-          <w:szCs w:val="28"/>
-        </w:rPr>
-        <w:t>Array ?</w:t>
-      </w:r>
-      <w:proofErr w:type="gramEnd"/>
-    </w:p>
-    <w:p>
-      <w:pPr>
-        <w:rPr>
-          <w:b/>
-          <w:bCs/>
-          <w:sz w:val="28"/>
-          <w:szCs w:val="28"/>
-        </w:rPr>
-      </w:pPr>
-      <w:r>
-        <w:rPr>
-          <w:b/>
-          <w:bCs/>
-          <w:sz w:val="28"/>
-          <w:szCs w:val="28"/>
-        </w:rPr>
-        <w:t xml:space="preserve">13) what are the different ways to initialize the </w:t>
-      </w:r>
-      <w:proofErr w:type="gramStart"/>
-      <w:r>
-        <w:rPr>
-          <w:b/>
-          <w:bCs/>
-          <w:sz w:val="28"/>
-          <w:szCs w:val="28"/>
-        </w:rPr>
-        <w:t>array ?</w:t>
-      </w:r>
-      <w:proofErr w:type="gramEnd"/>
+        <w:t xml:space="preserve"> of </w:t>
+      </w:r>
+      <w:r>
+        <w:rPr>
+          <w:b/>
+          <w:bCs/>
+          <w:sz w:val="28"/>
+          <w:szCs w:val="28"/>
+        </w:rPr>
+        <w:t xml:space="preserve"> == and .equals() in Java?</w:t>
+      </w:r>
+    </w:p>
+    <w:p>
+      <w:pPr>
+        <w:rPr>
+          <w:b/>
+          <w:bCs/>
+          <w:sz w:val="28"/>
+          <w:szCs w:val="28"/>
+        </w:rPr>
+      </w:pPr>
+      <w:r>
+        <w:rPr>
+          <w:b/>
+          <w:bCs/>
+          <w:sz w:val="28"/>
+          <w:szCs w:val="28"/>
+        </w:rPr>
+        <w:t>12)what is Array ?</w:t>
+      </w:r>
+    </w:p>
+    <w:p>
+      <w:pPr>
+        <w:rPr>
+          <w:b/>
+          <w:bCs/>
+          <w:sz w:val="28"/>
+          <w:szCs w:val="28"/>
+        </w:rPr>
+      </w:pPr>
+      <w:r>
+        <w:rPr>
+          <w:b/>
+          <w:bCs/>
+          <w:sz w:val="28"/>
+          <w:szCs w:val="28"/>
+        </w:rPr>
+        <w:t>13) what are the different ways to initialize the array ?</w:t>
+      </w:r>
     </w:p>
     <w:p>
       <w:pPr>
@@ -507,179 +381,84 @@
           <w:sz w:val="28"/>
           <w:szCs w:val="28"/>
         </w:rPr>
-        <w:t xml:space="preserve">15) what’s 2D </w:t>
-      </w:r>
-      <w:proofErr w:type="gramStart"/>
-      <w:r>
-        <w:rPr>
-          <w:b/>
-          <w:bCs/>
-          <w:sz w:val="28"/>
-          <w:szCs w:val="28"/>
-        </w:rPr>
-        <w:t>array ?</w:t>
-      </w:r>
-      <w:proofErr w:type="gramEnd"/>
-    </w:p>
-    <w:p>
-      <w:pPr>
-        <w:rPr>
-          <w:b/>
-          <w:bCs/>
-          <w:sz w:val="28"/>
-          <w:szCs w:val="28"/>
-        </w:rPr>
-      </w:pPr>
-      <w:r>
-        <w:rPr>
-          <w:b/>
-          <w:bCs/>
-          <w:sz w:val="28"/>
-          <w:szCs w:val="28"/>
-        </w:rPr>
-        <w:t xml:space="preserve">16)what’s </w:t>
-      </w:r>
-      <w:proofErr w:type="gramStart"/>
-      <w:r>
-        <w:rPr>
-          <w:b/>
-          <w:bCs/>
-          <w:sz w:val="28"/>
-          <w:szCs w:val="28"/>
-        </w:rPr>
-        <w:t>multidimensional  and</w:t>
-      </w:r>
-      <w:proofErr w:type="gramEnd"/>
-      <w:r>
-        <w:rPr>
-          <w:b/>
-          <w:bCs/>
-          <w:sz w:val="28"/>
-          <w:szCs w:val="28"/>
-        </w:rPr>
-        <w:t xml:space="preserve"> jagged </w:t>
-      </w:r>
-      <w:proofErr w:type="gramStart"/>
-      <w:r>
-        <w:rPr>
-          <w:b/>
-          <w:bCs/>
-          <w:sz w:val="28"/>
-          <w:szCs w:val="28"/>
-        </w:rPr>
-        <w:t>array ?</w:t>
-      </w:r>
-      <w:proofErr w:type="gramEnd"/>
-    </w:p>
-    <w:p>
-      <w:pPr>
-        <w:rPr>
-          <w:b/>
-          <w:bCs/>
-          <w:sz w:val="28"/>
-          <w:szCs w:val="28"/>
-        </w:rPr>
-      </w:pPr>
-      <w:r>
-        <w:rPr>
-          <w:b/>
-          <w:bCs/>
-          <w:sz w:val="28"/>
-          <w:szCs w:val="28"/>
-        </w:rPr>
-        <w:t xml:space="preserve">17)decide whether the given matrix is </w:t>
-      </w:r>
-      <w:proofErr w:type="gramStart"/>
-      <w:r>
-        <w:rPr>
-          <w:b/>
-          <w:bCs/>
-          <w:sz w:val="28"/>
-          <w:szCs w:val="28"/>
-        </w:rPr>
-        <w:t>diagonal ?</w:t>
-      </w:r>
-      <w:proofErr w:type="gramEnd"/>
-    </w:p>
-    <w:p>
-      <w:pPr>
-        <w:rPr>
-          <w:b/>
-          <w:bCs/>
-          <w:sz w:val="28"/>
-          <w:szCs w:val="28"/>
-        </w:rPr>
-      </w:pPr>
-      <w:r>
-        <w:rPr>
-          <w:b/>
-          <w:bCs/>
-          <w:sz w:val="28"/>
-          <w:szCs w:val="28"/>
-        </w:rPr>
-        <w:t xml:space="preserve">18) return true if all </w:t>
-      </w:r>
-      <w:proofErr w:type="gramStart"/>
-      <w:r>
-        <w:rPr>
-          <w:b/>
-          <w:bCs/>
-          <w:sz w:val="28"/>
-          <w:szCs w:val="28"/>
-        </w:rPr>
-        <w:t>the  diagonal</w:t>
-      </w:r>
-      <w:proofErr w:type="gramEnd"/>
-      <w:r>
-        <w:rPr>
-          <w:b/>
-          <w:bCs/>
-          <w:sz w:val="28"/>
-          <w:szCs w:val="28"/>
-        </w:rPr>
-        <w:t xml:space="preserve"> elements are </w:t>
-      </w:r>
-      <w:proofErr w:type="gramStart"/>
-      <w:r>
-        <w:rPr>
-          <w:b/>
-          <w:bCs/>
-          <w:sz w:val="28"/>
-          <w:szCs w:val="28"/>
-        </w:rPr>
-        <w:t>prime ?</w:t>
-      </w:r>
-      <w:proofErr w:type="gramEnd"/>
-    </w:p>
-    <w:p>
-      <w:pPr>
-        <w:rPr>
-          <w:b/>
-          <w:bCs/>
-          <w:sz w:val="28"/>
-          <w:szCs w:val="28"/>
-        </w:rPr>
-      </w:pPr>
-      <w:r>
-        <w:rPr>
-          <w:b/>
-          <w:bCs/>
-          <w:sz w:val="28"/>
-          <w:szCs w:val="28"/>
-        </w:rPr>
-        <w:t xml:space="preserve">19)what’s </w:t>
-      </w:r>
-      <w:proofErr w:type="gramStart"/>
-      <w:r>
-        <w:rPr>
-          <w:b/>
-          <w:bCs/>
-          <w:sz w:val="28"/>
-          <w:szCs w:val="28"/>
-        </w:rPr>
-        <w:t>String ?</w:t>
-      </w:r>
-      <w:proofErr w:type="gramEnd"/>
+        <w:t>15) what’s 2D array ?</w:t>
+      </w:r>
+    </w:p>
+    <w:p>
+      <w:pPr>
+        <w:rPr>
+          <w:b/>
+          <w:bCs/>
+          <w:sz w:val="28"/>
+          <w:szCs w:val="28"/>
+        </w:rPr>
+      </w:pPr>
+      <w:r>
+        <w:rPr>
+          <w:b/>
+          <w:bCs/>
+          <w:sz w:val="28"/>
+          <w:szCs w:val="28"/>
+        </w:rPr>
+        <w:t>16)what’s multidimensional  and jagged array ?</w:t>
+      </w:r>
+    </w:p>
+    <w:p>
+      <w:pPr>
+        <w:rPr>
+          <w:b/>
+          <w:bCs/>
+          <w:sz w:val="28"/>
+          <w:szCs w:val="28"/>
+        </w:rPr>
+      </w:pPr>
+      <w:r>
+        <w:rPr>
+          <w:b/>
+          <w:bCs/>
+          <w:sz w:val="28"/>
+          <w:szCs w:val="28"/>
+        </w:rPr>
+        <w:t>17)decide whether the given matrix is diagonal ?</w:t>
+      </w:r>
+    </w:p>
+    <w:p>
+      <w:pPr>
+        <w:rPr>
+          <w:b/>
+          <w:bCs/>
+          <w:sz w:val="28"/>
+          <w:szCs w:val="28"/>
+        </w:rPr>
+      </w:pPr>
+      <w:r>
+        <w:rPr>
+          <w:b/>
+          <w:bCs/>
+          <w:sz w:val="28"/>
+          <w:szCs w:val="28"/>
+        </w:rPr>
+        <w:t>18) return true if all the  diagonal elements are prime ?</w:t>
+      </w:r>
+    </w:p>
+    <w:p>
+      <w:pPr>
+        <w:rPr>
+          <w:b/>
+          <w:bCs/>
+          <w:sz w:val="28"/>
+          <w:szCs w:val="28"/>
+        </w:rPr>
+      </w:pPr>
+      <w:r>
+        <w:rPr>
+          <w:b/>
+          <w:bCs/>
+          <w:sz w:val="28"/>
+          <w:szCs w:val="28"/>
+        </w:rPr>
+        <w:t>19)what’s String ?</w:t>
+      </w:r>
     </w:p>
     <w:p>
       <w:pPr>
@@ -736,79 +515,46 @@
           <w:sz w:val="28"/>
           <w:szCs w:val="28"/>
         </w:rPr>
-        <w:t xml:space="preserve">22) what are methods in the </w:t>
-      </w:r>
-      <w:proofErr w:type="gramStart"/>
-      <w:r>
-        <w:rPr>
-          <w:b/>
-          <w:bCs/>
-          <w:sz w:val="28"/>
-          <w:szCs w:val="28"/>
-        </w:rPr>
-        <w:t>java ?</w:t>
-      </w:r>
-      <w:proofErr w:type="gramEnd"/>
-    </w:p>
-    <w:p>
-      <w:pPr>
-        <w:rPr>
-          <w:b/>
-          <w:bCs/>
-          <w:sz w:val="28"/>
-          <w:szCs w:val="28"/>
-        </w:rPr>
-      </w:pPr>
-      <w:r>
-        <w:rPr>
-          <w:b/>
-          <w:bCs/>
-          <w:sz w:val="28"/>
-          <w:szCs w:val="28"/>
-        </w:rPr>
-        <w:t xml:space="preserve">23)what’s the syntax of the methods in the </w:t>
-      </w:r>
-      <w:proofErr w:type="gramStart"/>
-      <w:r>
-        <w:rPr>
-          <w:b/>
-          <w:bCs/>
-          <w:sz w:val="28"/>
-          <w:szCs w:val="28"/>
-        </w:rPr>
-        <w:t>java ?</w:t>
-      </w:r>
-      <w:proofErr w:type="gramEnd"/>
-    </w:p>
-    <w:p>
-      <w:pPr>
-        <w:rPr>
-          <w:b/>
-          <w:bCs/>
-          <w:sz w:val="28"/>
-          <w:szCs w:val="28"/>
-        </w:rPr>
-      </w:pPr>
-      <w:r>
-        <w:rPr>
-          <w:b/>
-          <w:bCs/>
-          <w:sz w:val="28"/>
-          <w:szCs w:val="28"/>
-        </w:rPr>
-        <w:t xml:space="preserve">24)what are constructors in the </w:t>
-      </w:r>
-      <w:proofErr w:type="gramStart"/>
-      <w:r>
-        <w:rPr>
-          <w:b/>
-          <w:bCs/>
-          <w:sz w:val="28"/>
-          <w:szCs w:val="28"/>
-        </w:rPr>
-        <w:t>Java ?</w:t>
-      </w:r>
-      <w:proofErr w:type="gramEnd"/>
+        <w:t>22) what are methods in the java ?</w:t>
+      </w:r>
+    </w:p>
+    <w:p>
+      <w:pPr>
+        <w:rPr>
+          <w:b/>
+          <w:bCs/>
+          <w:sz w:val="28"/>
+          <w:szCs w:val="28"/>
+        </w:rPr>
+      </w:pPr>
+      <w:r>
+        <w:rPr>
+          <w:b/>
+          <w:bCs/>
+          <w:sz w:val="28"/>
+          <w:szCs w:val="28"/>
+        </w:rPr>
+        <w:t>23)what’s the syntax of the methods in the java ?</w:t>
+      </w:r>
+    </w:p>
+    <w:p>
+      <w:pPr>
+        <w:rPr>
+          <w:b/>
+          <w:bCs/>
+          <w:sz w:val="28"/>
+          <w:szCs w:val="28"/>
+        </w:rPr>
+      </w:pPr>
+      <w:r>
+        <w:rPr>
+          <w:b/>
+          <w:bCs/>
+          <w:sz w:val="28"/>
+          <w:szCs w:val="28"/>
+        </w:rPr>
+        <w:t>24)what are constructors in the Java ?</w:t>
+      </w:r>
     </w:p>
     <w:p>
       <w:pPr>
@@ -891,66 +637,26 @@
           <w:sz w:val="28"/>
           <w:szCs w:val="28"/>
         </w:rPr>
-        <w:t xml:space="preserve"> (this vs </w:t>
-      </w:r>
-      <w:proofErr w:type="gramStart"/>
-      <w:r>
-        <w:rPr>
-          <w:b/>
-          <w:bCs/>
-          <w:sz w:val="28"/>
-          <w:szCs w:val="28"/>
-        </w:rPr>
-        <w:t>this(</w:t>
-      </w:r>
-      <w:proofErr w:type="gramEnd"/>
-      <w:r>
-        <w:rPr>
-          <w:b/>
-          <w:bCs/>
-          <w:sz w:val="28"/>
-          <w:szCs w:val="28"/>
-        </w:rPr>
-        <w:t>));</w:t>
-      </w:r>
-    </w:p>
-    <w:p>
-      <w:pPr>
-        <w:rPr>
-          <w:b/>
-          <w:bCs/>
-          <w:sz w:val="28"/>
-          <w:szCs w:val="28"/>
-        </w:rPr>
-      </w:pPr>
-      <w:r>
-        <w:rPr>
-          <w:b/>
-          <w:bCs/>
-          <w:sz w:val="28"/>
-          <w:szCs w:val="28"/>
-        </w:rPr>
-        <w:t xml:space="preserve">28)Setters vs Getters vs </w:t>
-      </w:r>
-      <w:proofErr w:type="gramStart"/>
-      <w:r>
-        <w:rPr>
-          <w:b/>
-          <w:bCs/>
-          <w:sz w:val="28"/>
-          <w:szCs w:val="28"/>
-        </w:rPr>
-        <w:t>Other</w:t>
-      </w:r>
-      <w:proofErr w:type="gramEnd"/>
-      <w:r>
-        <w:rPr>
-          <w:b/>
-          <w:bCs/>
-          <w:sz w:val="28"/>
-          <w:szCs w:val="28"/>
-        </w:rPr>
-        <w:t xml:space="preserve"> methods.</w:t>
+        <w:t xml:space="preserve"> (this vs this());</w:t>
+      </w:r>
+    </w:p>
+    <w:p>
+      <w:pPr>
+        <w:rPr>
+          <w:b/>
+          <w:bCs/>
+          <w:sz w:val="28"/>
+          <w:szCs w:val="28"/>
+        </w:rPr>
+      </w:pPr>
+      <w:r>
+        <w:rPr>
+          <w:b/>
+          <w:bCs/>
+          <w:sz w:val="28"/>
+          <w:szCs w:val="28"/>
+        </w:rPr>
+        <w:t>28)Setters vs Getters vs Other methods.</w:t>
       </w:r>
     </w:p>
     <w:p>
@@ -988,27 +694,7 @@
           <w:sz w:val="28"/>
           <w:szCs w:val="28"/>
         </w:rPr>
-        <w:t xml:space="preserve">30) String </w:t>
-      </w:r>
-      <w:proofErr w:type="gramStart"/>
-      <w:r>
-        <w:rPr>
-          <w:b/>
-          <w:bCs/>
-          <w:sz w:val="28"/>
-          <w:szCs w:val="28"/>
-        </w:rPr>
-        <w:t>immutability :</w:t>
-      </w:r>
-      <w:proofErr w:type="gramEnd"/>
-      <w:r>
-        <w:rPr>
-          <w:b/>
-          <w:bCs/>
-          <w:sz w:val="28"/>
-          <w:szCs w:val="28"/>
-        </w:rPr>
-        <w:t xml:space="preserve"> prove it.</w:t>
+        <w:t>30) String immutability : prove it.</w:t>
       </w:r>
     </w:p>
     <w:p>
@@ -1036,302 +722,230 @@
           <w:sz w:val="28"/>
           <w:szCs w:val="28"/>
         </w:rPr>
+        <w:t xml:space="preserve"> SCP :Explain.</w:t>
+      </w:r>
+    </w:p>
+    <w:p>
+      <w:pPr>
+        <w:rPr>
+          <w:b/>
+          <w:bCs/>
+          <w:sz w:val="28"/>
+          <w:szCs w:val="28"/>
+        </w:rPr>
+      </w:pPr>
+      <w:r>
+        <w:rPr>
+          <w:b/>
+          <w:bCs/>
+          <w:sz w:val="28"/>
+          <w:szCs w:val="28"/>
+        </w:rPr>
+        <w:t xml:space="preserve">32) String vs </w:t>
+      </w:r>
+      <w:proofErr w:type="spellStart"/>
+      <w:r>
+        <w:rPr>
+          <w:b/>
+          <w:bCs/>
+          <w:sz w:val="28"/>
+          <w:szCs w:val="28"/>
+        </w:rPr>
+        <w:t>StringBuffer</w:t>
+      </w:r>
+      <w:proofErr w:type="spellEnd"/>
+      <w:r>
+        <w:rPr>
+          <w:b/>
+          <w:bCs/>
+          <w:sz w:val="28"/>
+          <w:szCs w:val="28"/>
+        </w:rPr>
+        <w:t xml:space="preserve"> vs StringBuilder.</w:t>
+      </w:r>
+    </w:p>
+    <w:p>
+      <w:pPr>
+        <w:rPr>
+          <w:b/>
+          <w:bCs/>
+          <w:sz w:val="28"/>
+          <w:szCs w:val="28"/>
+        </w:rPr>
+      </w:pPr>
+      <w:r>
+        <w:rPr>
+          <w:b/>
+          <w:bCs/>
+          <w:sz w:val="28"/>
+          <w:szCs w:val="28"/>
+        </w:rPr>
+        <w:t xml:space="preserve">33) what is String interning ? </w:t>
+      </w:r>
+      <w:proofErr w:type="spellStart"/>
+      <w:r>
+        <w:rPr>
+          <w:b/>
+          <w:bCs/>
+          <w:sz w:val="28"/>
+          <w:szCs w:val="28"/>
+        </w:rPr>
+        <w:t>String.intern</w:t>
+      </w:r>
+      <w:proofErr w:type="spellEnd"/>
+      <w:r>
+        <w:rPr>
+          <w:b/>
+          <w:bCs/>
+          <w:sz w:val="28"/>
+          <w:szCs w:val="28"/>
+        </w:rPr>
+        <w:t xml:space="preserve">() method and why is Interning not possible in </w:t>
+      </w:r>
+      <w:proofErr w:type="spellStart"/>
+      <w:r>
+        <w:rPr>
+          <w:b/>
+          <w:bCs/>
+          <w:sz w:val="28"/>
+          <w:szCs w:val="28"/>
+        </w:rPr>
+        <w:t>StringBuffer</w:t>
+      </w:r>
+      <w:proofErr w:type="spellEnd"/>
+      <w:r>
+        <w:rPr>
+          <w:b/>
+          <w:bCs/>
+          <w:sz w:val="28"/>
+          <w:szCs w:val="28"/>
+        </w:rPr>
+        <w:t xml:space="preserve"> and StringBuilder?</w:t>
+      </w:r>
+    </w:p>
+    <w:p>
+      <w:pPr>
+        <w:rPr>
+          <w:b/>
+          <w:bCs/>
+          <w:sz w:val="28"/>
+          <w:szCs w:val="28"/>
+        </w:rPr>
+      </w:pPr>
+      <w:r>
+        <w:rPr>
+          <w:b/>
+          <w:bCs/>
+          <w:sz w:val="28"/>
+          <w:szCs w:val="28"/>
+        </w:rPr>
+        <w:t>34) demonstrate the use of the .Intern() method.</w:t>
+      </w:r>
+    </w:p>
+    <w:p>
+      <w:pPr>
+        <w:rPr>
+          <w:b/>
+          <w:bCs/>
+          <w:sz w:val="28"/>
+          <w:szCs w:val="28"/>
+        </w:rPr>
+      </w:pPr>
+      <w:r>
+        <w:rPr>
+          <w:b/>
+          <w:bCs/>
+          <w:sz w:val="28"/>
+          <w:szCs w:val="28"/>
+        </w:rPr>
+        <w:t>35)what is ternary operator ?</w:t>
+      </w:r>
+    </w:p>
+    <w:p>
+      <w:pPr>
+        <w:rPr>
+          <w:b/>
+          <w:bCs/>
+          <w:sz w:val="28"/>
+          <w:szCs w:val="28"/>
+        </w:rPr>
+      </w:pPr>
+      <w:r>
+        <w:rPr>
+          <w:b/>
+          <w:bCs/>
+          <w:sz w:val="28"/>
+          <w:szCs w:val="28"/>
+        </w:rPr>
+        <w:t>36) explain why shouldn’t we use the nested ternary OP.</w:t>
+      </w:r>
+    </w:p>
+    <w:p>
+      <w:pPr>
+        <w:rPr>
+          <w:b/>
+          <w:bCs/>
+          <w:sz w:val="28"/>
+          <w:szCs w:val="28"/>
+        </w:rPr>
+      </w:pPr>
+      <w:r>
+        <w:rPr>
+          <w:b/>
+          <w:bCs/>
+          <w:sz w:val="28"/>
+          <w:szCs w:val="28"/>
+        </w:rPr>
+        <w:t>37)</w:t>
+      </w:r>
+      <w:proofErr w:type="spellStart"/>
+      <w:r>
+        <w:rPr>
+          <w:b/>
+          <w:bCs/>
+          <w:sz w:val="28"/>
+          <w:szCs w:val="28"/>
+        </w:rPr>
+        <w:t>instaceof</w:t>
+      </w:r>
+      <w:proofErr w:type="spellEnd"/>
+      <w:r>
+        <w:rPr>
+          <w:b/>
+          <w:bCs/>
+          <w:sz w:val="28"/>
+          <w:szCs w:val="28"/>
+        </w:rPr>
+        <w:t xml:space="preserve"> operator.</w:t>
+      </w:r>
+    </w:p>
+    <w:p>
+      <w:pPr>
+        <w:rPr>
+          <w:b/>
+          <w:bCs/>
+          <w:sz w:val="28"/>
+          <w:szCs w:val="28"/>
+        </w:rPr>
+      </w:pPr>
+      <w:r>
+        <w:rPr>
+          <w:b/>
+          <w:bCs/>
+          <w:sz w:val="28"/>
+          <w:szCs w:val="28"/>
+        </w:rPr>
+        <w:t>38)why java is not purely oops oriented?</w:t>
+      </w:r>
+      <w:r>
+        <w:rPr>
+          <w:b/>
+          <w:bCs/>
+          <w:sz w:val="28"/>
+          <w:szCs w:val="28"/>
+        </w:rPr>
         <w:t xml:space="preserve"> </w:t>
       </w:r>
-      <w:proofErr w:type="gramStart"/>
-      <w:r>
-        <w:rPr>
-          <w:b/>
-          <w:bCs/>
-          <w:sz w:val="28"/>
-          <w:szCs w:val="28"/>
-        </w:rPr>
-        <w:t>SCP :Explain</w:t>
-      </w:r>
-      <w:proofErr w:type="gramEnd"/>
-      <w:r>
-        <w:rPr>
-          <w:b/>
-          <w:bCs/>
-          <w:sz w:val="28"/>
-          <w:szCs w:val="28"/>
-        </w:rPr>
-        <w:t>.</w:t>
-      </w:r>
-    </w:p>
-    <w:p>
-      <w:pPr>
-        <w:rPr>
-          <w:b/>
-          <w:bCs/>
-          <w:sz w:val="28"/>
-          <w:szCs w:val="28"/>
-        </w:rPr>
-      </w:pPr>
-      <w:r>
-        <w:rPr>
-          <w:b/>
-          <w:bCs/>
-          <w:sz w:val="28"/>
-          <w:szCs w:val="28"/>
-        </w:rPr>
-        <w:t xml:space="preserve">32) String vs </w:t>
-      </w:r>
-      <w:proofErr w:type="spellStart"/>
-      <w:r>
-        <w:rPr>
-          <w:b/>
-          <w:bCs/>
-          <w:sz w:val="28"/>
-          <w:szCs w:val="28"/>
-        </w:rPr>
-        <w:t>StringBuffer</w:t>
-      </w:r>
-      <w:proofErr w:type="spellEnd"/>
-      <w:r>
-        <w:rPr>
-          <w:b/>
-          <w:bCs/>
-          <w:sz w:val="28"/>
-          <w:szCs w:val="28"/>
-        </w:rPr>
-        <w:t xml:space="preserve"> vs StringBuilder.</w:t>
-      </w:r>
-    </w:p>
-    <w:p>
-      <w:pPr>
-        <w:rPr>
-          <w:b/>
-          <w:bCs/>
-          <w:sz w:val="28"/>
-          <w:szCs w:val="28"/>
-        </w:rPr>
-      </w:pPr>
-      <w:r>
-        <w:rPr>
-          <w:b/>
-          <w:bCs/>
-          <w:sz w:val="28"/>
-          <w:szCs w:val="28"/>
-        </w:rPr>
-        <w:t xml:space="preserve">33) what is String </w:t>
-      </w:r>
-      <w:proofErr w:type="gramStart"/>
-      <w:r>
-        <w:rPr>
-          <w:b/>
-          <w:bCs/>
-          <w:sz w:val="28"/>
-          <w:szCs w:val="28"/>
-        </w:rPr>
-        <w:t>interning ?</w:t>
-      </w:r>
-      <w:proofErr w:type="gramEnd"/>
-      <w:r>
-        <w:rPr>
-          <w:b/>
-          <w:bCs/>
-          <w:sz w:val="28"/>
-          <w:szCs w:val="28"/>
-        </w:rPr>
-        <w:t xml:space="preserve"> </w:t>
-      </w:r>
-      <w:proofErr w:type="spellStart"/>
-      <w:r>
-        <w:rPr>
-          <w:b/>
-          <w:bCs/>
-          <w:sz w:val="28"/>
-          <w:szCs w:val="28"/>
-        </w:rPr>
-        <w:t>String.intern</w:t>
-      </w:r>
-      <w:proofErr w:type="spellEnd"/>
-      <w:r>
-        <w:rPr>
-          <w:b/>
-          <w:bCs/>
-          <w:sz w:val="28"/>
-          <w:szCs w:val="28"/>
-        </w:rPr>
-        <w:t xml:space="preserve">() method and why is Interning not possible in </w:t>
-      </w:r>
-      <w:proofErr w:type="spellStart"/>
-      <w:r>
-        <w:rPr>
-          <w:b/>
-          <w:bCs/>
-          <w:sz w:val="28"/>
-          <w:szCs w:val="28"/>
-        </w:rPr>
-        <w:t>StringBuffer</w:t>
-      </w:r>
-      <w:proofErr w:type="spellEnd"/>
-      <w:r>
-        <w:rPr>
-          <w:b/>
-          <w:bCs/>
-          <w:sz w:val="28"/>
-          <w:szCs w:val="28"/>
-        </w:rPr>
-        <w:t xml:space="preserve"> and StringBuilder?</w:t>
-      </w:r>
-    </w:p>
-    <w:p>
-      <w:pPr>
-        <w:rPr>
-          <w:b/>
-          <w:bCs/>
-          <w:sz w:val="28"/>
-          <w:szCs w:val="28"/>
-        </w:rPr>
-      </w:pPr>
-      <w:r>
-        <w:rPr>
-          <w:b/>
-          <w:bCs/>
-          <w:sz w:val="28"/>
-          <w:szCs w:val="28"/>
-        </w:rPr>
-        <w:t xml:space="preserve">34) demonstrate the use of </w:t>
-      </w:r>
-      <w:proofErr w:type="gramStart"/>
-      <w:r>
-        <w:rPr>
-          <w:b/>
-          <w:bCs/>
-          <w:sz w:val="28"/>
-          <w:szCs w:val="28"/>
-        </w:rPr>
-        <w:t>the .Intern</w:t>
-      </w:r>
-      <w:proofErr w:type="gramEnd"/>
-      <w:r>
-        <w:rPr>
-          <w:b/>
-          <w:bCs/>
-          <w:sz w:val="28"/>
-          <w:szCs w:val="28"/>
-        </w:rPr>
-        <w:t>() method.</w:t>
-      </w:r>
-    </w:p>
-    <w:p>
-      <w:pPr>
-        <w:rPr>
-          <w:b/>
-          <w:bCs/>
-          <w:sz w:val="28"/>
-          <w:szCs w:val="28"/>
-        </w:rPr>
-      </w:pPr>
-      <w:r>
-        <w:rPr>
-          <w:b/>
-          <w:bCs/>
-          <w:sz w:val="28"/>
-          <w:szCs w:val="28"/>
-        </w:rPr>
-        <w:t xml:space="preserve">35)what is ternary </w:t>
-      </w:r>
-      <w:proofErr w:type="gramStart"/>
-      <w:r>
-        <w:rPr>
-          <w:b/>
-          <w:bCs/>
-          <w:sz w:val="28"/>
-          <w:szCs w:val="28"/>
-        </w:rPr>
-        <w:t>operator ?</w:t>
-      </w:r>
-      <w:proofErr w:type="gramEnd"/>
-    </w:p>
-    <w:p>
-      <w:pPr>
-        <w:rPr>
-          <w:b/>
-          <w:bCs/>
-          <w:sz w:val="28"/>
-          <w:szCs w:val="28"/>
-        </w:rPr>
-      </w:pPr>
-      <w:r>
-        <w:rPr>
-          <w:b/>
-          <w:bCs/>
-          <w:sz w:val="28"/>
-          <w:szCs w:val="28"/>
-        </w:rPr>
-        <w:t>36) explain why shouldn’t we use the nested ternary OP.</w:t>
-      </w:r>
-    </w:p>
-    <w:p>
-      <w:pPr>
-        <w:rPr>
-          <w:b/>
-          <w:bCs/>
-          <w:sz w:val="28"/>
-          <w:szCs w:val="28"/>
-        </w:rPr>
-      </w:pPr>
-      <w:r>
-        <w:rPr>
-          <w:b/>
-          <w:bCs/>
-          <w:sz w:val="28"/>
-          <w:szCs w:val="28"/>
-        </w:rPr>
-        <w:t>37)</w:t>
-      </w:r>
-      <w:proofErr w:type="spellStart"/>
-      <w:r>
-        <w:rPr>
-          <w:b/>
-          <w:bCs/>
-          <w:sz w:val="28"/>
-          <w:szCs w:val="28"/>
-        </w:rPr>
-        <w:t>instaceof</w:t>
-      </w:r>
-      <w:proofErr w:type="spellEnd"/>
-      <w:r>
-        <w:rPr>
-          <w:b/>
-          <w:bCs/>
-          <w:sz w:val="28"/>
-          <w:szCs w:val="28"/>
-        </w:rPr>
-        <w:t xml:space="preserve"> operator.</w:t>
-      </w:r>
-    </w:p>
-    <w:p>
-      <w:pPr>
-        <w:rPr>
-          <w:b/>
-          <w:bCs/>
-          <w:sz w:val="28"/>
-          <w:szCs w:val="28"/>
-        </w:rPr>
-      </w:pPr>
-      <w:r>
-        <w:rPr>
-          <w:b/>
-          <w:bCs/>
-          <w:sz w:val="28"/>
-          <w:szCs w:val="28"/>
-        </w:rPr>
-        <w:t>38)why java is not purely oops oriented?</w:t>
-      </w:r>
-      <w:r>
-        <w:rPr>
-          <w:b/>
-          <w:bCs/>
-          <w:sz w:val="28"/>
-          <w:szCs w:val="28"/>
-        </w:rPr>
-        <w:t xml:space="preserve"> </w:t>
-      </w:r>
-      <w:proofErr w:type="gramStart"/>
       <w:r>
         <w:rPr>
           <w:b/>
@@ -1341,7 +955,6 @@
         </w:rPr>
         <w:t>explain .</w:t>
       </w:r>
-      <w:proofErr w:type="gramEnd"/>
     </w:p>
     <w:p>
       <w:pPr>
@@ -1378,19 +991,8 @@
           <w:sz w:val="28"/>
           <w:szCs w:val="28"/>
         </w:rPr>
-        <w:t xml:space="preserve">40) how will you achieve the data security in </w:t>
-      </w:r>
-      <w:proofErr w:type="gramStart"/>
-      <w:r>
-        <w:rPr>
-          <w:b/>
-          <w:bCs/>
-          <w:sz w:val="28"/>
-          <w:szCs w:val="28"/>
-        </w:rPr>
-        <w:t>encapsulation ?</w:t>
-      </w:r>
-      <w:proofErr w:type="gramEnd"/>
+        <w:t>40) how will you achieve the data security in encapsulation ?</w:t>
+      </w:r>
     </w:p>
     <w:p>
       <w:pPr>
@@ -1504,19 +1106,8 @@
           <w:sz w:val="28"/>
           <w:szCs w:val="28"/>
         </w:rPr>
-        <w:t xml:space="preserve">44)what is inheritance in </w:t>
-      </w:r>
-      <w:proofErr w:type="gramStart"/>
-      <w:r>
-        <w:rPr>
-          <w:b/>
-          <w:bCs/>
-          <w:sz w:val="28"/>
-          <w:szCs w:val="28"/>
-        </w:rPr>
-        <w:t>java ?</w:t>
-      </w:r>
-      <w:proofErr w:type="gramEnd"/>
+        <w:t>44)what is inheritance in java ?</w:t>
+      </w:r>
     </w:p>
     <w:p>
       <w:pPr>
@@ -1553,27 +1144,7 @@
           <w:sz w:val="28"/>
           <w:szCs w:val="28"/>
         </w:rPr>
-        <w:t xml:space="preserve">46)what is the use of the inheritance in </w:t>
-      </w:r>
-      <w:proofErr w:type="gramStart"/>
-      <w:r>
-        <w:rPr>
-          <w:b/>
-          <w:bCs/>
-          <w:sz w:val="28"/>
-          <w:szCs w:val="28"/>
-        </w:rPr>
-        <w:t>java ?</w:t>
-      </w:r>
-      <w:proofErr w:type="gramEnd"/>
-      <w:r>
-        <w:rPr>
-          <w:b/>
-          <w:bCs/>
-          <w:sz w:val="28"/>
-          <w:szCs w:val="28"/>
-        </w:rPr>
-        <w:t>(</w:t>
+        <w:t>46)what is the use of the inheritance in java ?(</w:t>
       </w:r>
       <w:r>
         <w:rPr>
@@ -1630,19 +1201,8 @@
           <w:sz w:val="28"/>
           <w:szCs w:val="28"/>
         </w:rPr>
-        <w:t xml:space="preserve">48) why multiple inheritance is not supported in </w:t>
-      </w:r>
-      <w:proofErr w:type="gramStart"/>
-      <w:r>
-        <w:rPr>
-          <w:b/>
-          <w:bCs/>
-          <w:sz w:val="28"/>
-          <w:szCs w:val="28"/>
-        </w:rPr>
-        <w:t>java ?</w:t>
-      </w:r>
-      <w:proofErr w:type="gramEnd"/>
+        <w:t>48) why multiple inheritance is not supported in java ?</w:t>
+      </w:r>
     </w:p>
     <w:p>
       <w:pPr>
@@ -1680,109 +1240,65 @@
           <w:sz w:val="28"/>
           <w:szCs w:val="28"/>
         </w:rPr>
-        <w:t xml:space="preserve">) in </w:t>
-      </w:r>
-      <w:proofErr w:type="gramStart"/>
-      <w:r>
-        <w:rPr>
-          <w:b/>
-          <w:bCs/>
-          <w:sz w:val="28"/>
-          <w:szCs w:val="28"/>
-        </w:rPr>
-        <w:t>java ?</w:t>
-      </w:r>
-      <w:proofErr w:type="gramEnd"/>
-    </w:p>
-    <w:p>
-      <w:pPr>
-        <w:rPr>
-          <w:b/>
-          <w:bCs/>
-          <w:sz w:val="28"/>
-          <w:szCs w:val="28"/>
-        </w:rPr>
-      </w:pPr>
-      <w:r>
-        <w:rPr>
-          <w:b/>
-          <w:bCs/>
-          <w:sz w:val="28"/>
-          <w:szCs w:val="28"/>
-        </w:rPr>
-        <w:t xml:space="preserve">50) how does private variables play in the </w:t>
-      </w:r>
-      <w:proofErr w:type="gramStart"/>
-      <w:r>
-        <w:rPr>
-          <w:b/>
-          <w:bCs/>
-          <w:sz w:val="28"/>
-          <w:szCs w:val="28"/>
-        </w:rPr>
-        <w:t>inheritance ?</w:t>
-      </w:r>
-      <w:proofErr w:type="gramEnd"/>
-    </w:p>
-    <w:p>
-      <w:pPr>
-        <w:rPr>
-          <w:b/>
-          <w:bCs/>
-          <w:sz w:val="28"/>
-          <w:szCs w:val="28"/>
-        </w:rPr>
-      </w:pPr>
-      <w:r>
-        <w:rPr>
-          <w:b/>
-          <w:bCs/>
-          <w:sz w:val="28"/>
-          <w:szCs w:val="28"/>
-        </w:rPr>
-        <w:t xml:space="preserve">51) what is </w:t>
-      </w:r>
-      <w:proofErr w:type="gramStart"/>
-      <w:r>
-        <w:rPr>
-          <w:b/>
-          <w:bCs/>
-          <w:sz w:val="28"/>
-          <w:szCs w:val="28"/>
-        </w:rPr>
-        <w:t>polymorphism ?</w:t>
-      </w:r>
-      <w:proofErr w:type="gramEnd"/>
-    </w:p>
-    <w:p>
-      <w:pPr>
-        <w:rPr>
-          <w:b/>
-          <w:bCs/>
-          <w:sz w:val="28"/>
-          <w:szCs w:val="28"/>
-        </w:rPr>
-      </w:pPr>
-      <w:r>
-        <w:rPr>
-          <w:b/>
-          <w:bCs/>
-          <w:sz w:val="28"/>
-          <w:szCs w:val="28"/>
-        </w:rPr>
-        <w:t xml:space="preserve">52)what is method overloading and </w:t>
-      </w:r>
-      <w:proofErr w:type="gramStart"/>
-      <w:r>
-        <w:rPr>
-          <w:b/>
-          <w:bCs/>
-          <w:sz w:val="28"/>
-          <w:szCs w:val="28"/>
-        </w:rPr>
-        <w:t>overriding ?</w:t>
-      </w:r>
-      <w:proofErr w:type="gramEnd"/>
+        <w:t>) in java ?</w:t>
+      </w:r>
+    </w:p>
+    <w:p>
+      <w:pPr>
+        <w:rPr>
+          <w:b/>
+          <w:bCs/>
+          <w:sz w:val="28"/>
+          <w:szCs w:val="28"/>
+        </w:rPr>
+      </w:pPr>
+      <w:r>
+        <w:rPr>
+          <w:b/>
+          <w:bCs/>
+          <w:sz w:val="28"/>
+          <w:szCs w:val="28"/>
+        </w:rPr>
+        <w:t>50) how does private variables play in the inheritance ?</w:t>
+      </w:r>
+    </w:p>
+    <w:p>
+      <w:pPr>
+        <w:rPr>
+          <w:b/>
+          <w:bCs/>
+          <w:sz w:val="28"/>
+          <w:szCs w:val="28"/>
+        </w:rPr>
+      </w:pPr>
+      <w:r>
+        <w:rPr>
+          <w:b/>
+          <w:bCs/>
+          <w:sz w:val="28"/>
+          <w:szCs w:val="28"/>
+        </w:rPr>
+        <w:t>51) what is polymorphism ?</w:t>
+      </w:r>
+    </w:p>
+    <w:p>
+      <w:pPr>
+        <w:rPr>
+          <w:b/>
+          <w:bCs/>
+          <w:sz w:val="28"/>
+          <w:szCs w:val="28"/>
+        </w:rPr>
+      </w:pPr>
+      <w:r>
+        <w:rPr>
+          <w:b/>
+          <w:bCs/>
+          <w:sz w:val="28"/>
+          <w:szCs w:val="28"/>
+        </w:rPr>
+        <w:t>52)what is method overloading and overriding ?</w:t>
+      </w:r>
     </w:p>
     <w:p>
       <w:pPr>
@@ -1877,49 +1393,27 @@
           <w:sz w:val="28"/>
           <w:szCs w:val="28"/>
         </w:rPr>
-        <w:t xml:space="preserve">56)why you can’t override the static and private </w:t>
-      </w:r>
-      <w:proofErr w:type="gramStart"/>
-      <w:r>
-        <w:rPr>
-          <w:b/>
-          <w:bCs/>
-          <w:sz w:val="28"/>
-          <w:szCs w:val="28"/>
-        </w:rPr>
-        <w:t>methods ?</w:t>
-      </w:r>
-      <w:proofErr w:type="gramEnd"/>
-    </w:p>
-    <w:p>
-      <w:pPr>
-        <w:rPr>
-          <w:b/>
-          <w:bCs/>
-          <w:sz w:val="28"/>
-          <w:szCs w:val="28"/>
-        </w:rPr>
-      </w:pPr>
-      <w:r>
-        <w:rPr>
-          <w:b/>
-          <w:bCs/>
-          <w:sz w:val="28"/>
-          <w:szCs w:val="28"/>
-        </w:rPr>
-        <w:t xml:space="preserve">57) what is method </w:t>
-      </w:r>
-      <w:proofErr w:type="gramStart"/>
-      <w:r>
-        <w:rPr>
-          <w:b/>
-          <w:bCs/>
-          <w:sz w:val="28"/>
-          <w:szCs w:val="28"/>
-        </w:rPr>
-        <w:t>hiding ?</w:t>
-      </w:r>
-      <w:proofErr w:type="gramEnd"/>
+        <w:t>56)why you can’t override the static and private methods ?</w:t>
+      </w:r>
+    </w:p>
+    <w:p>
+      <w:pPr>
+        <w:rPr>
+          <w:b/>
+          <w:bCs/>
+          <w:sz w:val="28"/>
+          <w:szCs w:val="28"/>
+        </w:rPr>
+      </w:pPr>
+      <w:r>
+        <w:rPr>
+          <w:b/>
+          <w:bCs/>
+          <w:sz w:val="28"/>
+          <w:szCs w:val="28"/>
+        </w:rPr>
+        <w:t>57) what is method hiding ?</w:t>
+      </w:r>
     </w:p>
     <w:p>
       <w:pPr>
@@ -1956,30 +1450,9 @@
           <w:sz w:val="28"/>
           <w:szCs w:val="28"/>
         </w:rPr>
-        <w:t xml:space="preserve">59)what is </w:t>
-      </w:r>
-      <w:proofErr w:type="gramStart"/>
-      <w:r>
-        <w:rPr>
-          <w:b/>
-          <w:bCs/>
-          <w:sz w:val="28"/>
-          <w:szCs w:val="28"/>
-        </w:rPr>
-        <w:t>super(</w:t>
-      </w:r>
-      <w:proofErr w:type="gramEnd"/>
-      <w:r>
-        <w:rPr>
-          <w:b/>
-          <w:bCs/>
-          <w:sz w:val="28"/>
-          <w:szCs w:val="28"/>
-        </w:rPr>
-        <w:t xml:space="preserve">) call </w:t>
+        <w:t xml:space="preserve">59)what is super() call </w:t>
       </w:r>
       <w:proofErr w:type="spellStart"/>
-      <w:proofErr w:type="gramStart"/>
       <w:r>
         <w:rPr>
           <w:b/>
@@ -1990,7 +1463,6 @@
         <w:t>super.variable</w:t>
       </w:r>
       <w:proofErr w:type="spellEnd"/>
-      <w:proofErr w:type="gramEnd"/>
       <w:r>
         <w:rPr>
           <w:b/>
@@ -2001,7 +1473,6 @@
         <w:t xml:space="preserve"> and </w:t>
       </w:r>
       <w:proofErr w:type="spellStart"/>
-      <w:proofErr w:type="gramStart"/>
       <w:r>
         <w:rPr>
           <w:b/>
@@ -2012,85 +1483,33 @@
         <w:t>super.method</w:t>
       </w:r>
       <w:proofErr w:type="spellEnd"/>
-      <w:proofErr w:type="gramEnd"/>
-      <w:r>
-        <w:rPr>
-          <w:b/>
-          <w:bCs/>
-          <w:sz w:val="28"/>
-          <w:szCs w:val="28"/>
-        </w:rPr>
-        <w:t xml:space="preserve">() call in </w:t>
-      </w:r>
-      <w:proofErr w:type="gramStart"/>
-      <w:r>
-        <w:rPr>
-          <w:b/>
-          <w:bCs/>
-          <w:sz w:val="28"/>
-          <w:szCs w:val="28"/>
-        </w:rPr>
-        <w:t>inheritance ?</w:t>
-      </w:r>
-      <w:proofErr w:type="gramEnd"/>
-    </w:p>
-    <w:p>
-      <w:pPr>
-        <w:rPr>
-          <w:b/>
-          <w:bCs/>
-          <w:sz w:val="28"/>
-          <w:szCs w:val="28"/>
-        </w:rPr>
-      </w:pPr>
-      <w:r>
-        <w:rPr>
-          <w:b/>
-          <w:bCs/>
-          <w:sz w:val="28"/>
-          <w:szCs w:val="28"/>
-        </w:rPr>
-        <w:t xml:space="preserve">60) </w:t>
-      </w:r>
-      <w:proofErr w:type="gramStart"/>
-      <w:r>
-        <w:rPr>
-          <w:b/>
-          <w:bCs/>
-          <w:sz w:val="28"/>
-          <w:szCs w:val="28"/>
-        </w:rPr>
-        <w:t>this(</w:t>
-      </w:r>
-      <w:proofErr w:type="gramEnd"/>
-      <w:r>
-        <w:rPr>
-          <w:b/>
-          <w:bCs/>
-          <w:sz w:val="28"/>
-          <w:szCs w:val="28"/>
-        </w:rPr>
-        <w:t xml:space="preserve">) vs </w:t>
-      </w:r>
-      <w:proofErr w:type="gramStart"/>
-      <w:r>
-        <w:rPr>
-          <w:b/>
-          <w:bCs/>
-          <w:sz w:val="28"/>
-          <w:szCs w:val="28"/>
-        </w:rPr>
-        <w:t>super(</w:t>
-      </w:r>
-      <w:proofErr w:type="gramEnd"/>
-      <w:r>
-        <w:rPr>
-          <w:b/>
-          <w:bCs/>
-          <w:sz w:val="28"/>
-          <w:szCs w:val="28"/>
-        </w:rPr>
-        <w:t>)</w:t>
+      <w:r>
+        <w:rPr>
+          <w:b/>
+          <w:bCs/>
+          <w:sz w:val="28"/>
+          <w:szCs w:val="28"/>
+        </w:rPr>
+        <w:t>() call in inheritance ?</w:t>
+      </w:r>
+    </w:p>
+    <w:p>
+      <w:pPr>
+        <w:rPr>
+          <w:b/>
+          <w:bCs/>
+          <w:sz w:val="28"/>
+          <w:szCs w:val="28"/>
+        </w:rPr>
+      </w:pPr>
+      <w:r>
+        <w:rPr>
+          <w:b/>
+          <w:bCs/>
+          <w:sz w:val="28"/>
+          <w:szCs w:val="28"/>
+        </w:rPr>
+        <w:t>60) this() vs super()</w:t>
       </w:r>
       <w:r>
         <w:rPr>
@@ -2120,6 +1539,15 @@
         </w:rPr>
         <w:t>61)</w:t>
       </w:r>
+      <w:r>
+        <w:rPr>
+          <w:b/>
+          <w:bCs/>
+          <w:sz w:val="28"/>
+          <w:szCs w:val="28"/>
+        </w:rPr>
+        <w:t>what is the hierarchy of exception handling in java?</w:t>
+      </w:r>
     </w:p>
     <w:p>
       <w:pPr>
@@ -2139,6 +1567,15 @@
         </w:rPr>
         <w:t>62)</w:t>
       </w:r>
+      <w:r>
+        <w:rPr>
+          <w:b/>
+          <w:bCs/>
+          <w:sz w:val="28"/>
+          <w:szCs w:val="28"/>
+        </w:rPr>
+        <w:t>Difference between Exception and Error.</w:t>
+      </w:r>
     </w:p>
     <w:p>
       <w:pPr>
@@ -2158,6 +1595,15 @@
         </w:rPr>
         <w:t>63)</w:t>
       </w:r>
+      <w:r>
+        <w:rPr>
+          <w:b/>
+          <w:bCs/>
+          <w:sz w:val="28"/>
+          <w:szCs w:val="28"/>
+        </w:rPr>
+        <w:t xml:space="preserve"> What is Checked and Unchecked Exception in Java.</w:t>
+      </w:r>
     </w:p>
     <w:p>
       <w:pPr>
@@ -2176,6 +1622,15 @@
           <w:szCs w:val="28"/>
         </w:rPr>
         <w:t>64)</w:t>
+      </w:r>
+      <w:r>
+        <w:rPr>
+          <w:b/>
+          <w:bCs/>
+          <w:sz w:val="28"/>
+          <w:szCs w:val="28"/>
+        </w:rPr>
+        <w:t xml:space="preserve"> how do you create Custom Runtime Exceptions in Java ?</w:t>
       </w:r>
     </w:p>
     <w:p>
@@ -2197,6 +1652,15 @@
         <w:lastRenderedPageBreak/>
         <w:t>65)</w:t>
       </w:r>
+      <w:r>
+        <w:rPr>
+          <w:b/>
+          <w:bCs/>
+          <w:sz w:val="28"/>
+          <w:szCs w:val="28"/>
+        </w:rPr>
+        <w:t>What is throwable in java exception handling ?</w:t>
+      </w:r>
     </w:p>
     <w:p>
       <w:pPr>
@@ -2216,6 +1680,15 @@
         </w:rPr>
         <w:t>66)</w:t>
       </w:r>
+      <w:r>
+        <w:rPr>
+          <w:b/>
+          <w:bCs/>
+          <w:sz w:val="28"/>
+          <w:szCs w:val="28"/>
+        </w:rPr>
+        <w:t xml:space="preserve"> Difference between Throw and Throws in java ?</w:t>
+      </w:r>
     </w:p>
     <w:p>
       <w:pPr>
@@ -2234,6 +1707,81 @@
           <w:szCs w:val="28"/>
         </w:rPr>
         <w:t>67)</w:t>
+      </w:r>
+      <w:r>
+        <w:rPr>
+          <w:b/>
+          <w:bCs/>
+          <w:sz w:val="28"/>
+          <w:szCs w:val="28"/>
+        </w:rPr>
+        <w:t>What is exception Propagation in Java ?</w:t>
+      </w:r>
+    </w:p>
+    <w:p>
+      <w:pPr>
+        <w:rPr>
+          <w:b/>
+          <w:bCs/>
+          <w:sz w:val="28"/>
+          <w:szCs w:val="28"/>
+        </w:rPr>
+      </w:pPr>
+      <w:r>
+        <w:rPr>
+          <w:b/>
+          <w:bCs/>
+          <w:sz w:val="28"/>
+          <w:szCs w:val="28"/>
+        </w:rPr>
+        <w:t>68)</w:t>
+      </w:r>
+      <w:r>
+        <w:rPr>
+          <w:b/>
+          <w:bCs/>
+          <w:sz w:val="28"/>
+          <w:szCs w:val="28"/>
+        </w:rPr>
+        <w:t xml:space="preserve"> What is the Order of sequence while writing multiple catch blocks with the Single try block in Java.</w:t>
+      </w:r>
+    </w:p>
+    <w:p>
+      <w:pPr>
+        <w:rPr>
+          <w:b/>
+          <w:bCs/>
+          <w:sz w:val="28"/>
+          <w:szCs w:val="28"/>
+        </w:rPr>
+      </w:pPr>
+      <w:r>
+        <w:rPr>
+          <w:b/>
+          <w:bCs/>
+          <w:sz w:val="28"/>
+          <w:szCs w:val="28"/>
+        </w:rPr>
+        <w:t>69)Does finally block always execute in the Java ?</w:t>
+      </w:r>
+    </w:p>
+    <w:p>
+      <w:pPr>
+        <w:rPr>
+          <w:b/>
+          <w:bCs/>
+          <w:sz w:val="28"/>
+          <w:szCs w:val="28"/>
+        </w:rPr>
+      </w:pPr>
+      <w:r>
+        <w:rPr>
+          <w:b/>
+          <w:bCs/>
+          <w:sz w:val="28"/>
+          <w:szCs w:val="28"/>
+        </w:rPr>
+        <w:t>70) five contracts of .equals() with itself ?</w:t>
       </w:r>
     </w:p>
     <w:p>

</xml_diff>

<commit_message>
.hashCode() and .equals() contract in Java
</commit_message>
<xml_diff>
--- a/JAVA_INT.docx
+++ b/JAVA_INT.docx
@@ -1642,14 +1642,23 @@
           <w:szCs w:val="28"/>
         </w:rPr>
       </w:pPr>
-      <w:r>
-        <w:rPr>
-          <w:b/>
-          <w:bCs/>
-          <w:sz w:val="28"/>
-          <w:szCs w:val="28"/>
-        </w:rPr>
-        <w:lastRenderedPageBreak/>
+    </w:p>
+    <w:p>
+      <w:pPr>
+        <w:rPr>
+          <w:b/>
+          <w:bCs/>
+          <w:sz w:val="28"/>
+          <w:szCs w:val="28"/>
+        </w:rPr>
+      </w:pPr>
+      <w:r>
+        <w:rPr>
+          <w:b/>
+          <w:bCs/>
+          <w:sz w:val="28"/>
+          <w:szCs w:val="28"/>
+        </w:rPr>
         <w:t>65)</w:t>
       </w:r>
       <w:r>
@@ -1782,6 +1791,45 @@
           <w:szCs w:val="28"/>
         </w:rPr>
         <w:t>70) five contracts of .equals() with itself ?</w:t>
+      </w:r>
+    </w:p>
+    <w:p>
+      <w:pPr>
+        <w:rPr>
+          <w:b/>
+          <w:bCs/>
+          <w:sz w:val="28"/>
+          <w:szCs w:val="28"/>
+        </w:rPr>
+      </w:pPr>
+      <w:r>
+        <w:rPr>
+          <w:b/>
+          <w:bCs/>
+          <w:sz w:val="28"/>
+          <w:szCs w:val="28"/>
+        </w:rPr>
+        <w:t>71)Contract between .equals() and .</w:t>
+      </w:r>
+      <w:proofErr w:type="spellStart"/>
+      <w:r>
+        <w:rPr>
+          <w:b/>
+          <w:bCs/>
+          <w:sz w:val="28"/>
+          <w:szCs w:val="28"/>
+        </w:rPr>
+        <w:t>hashCode</w:t>
+      </w:r>
+      <w:proofErr w:type="spellEnd"/>
+      <w:r>
+        <w:rPr>
+          <w:b/>
+          <w:bCs/>
+          <w:sz w:val="28"/>
+          <w:szCs w:val="28"/>
+        </w:rPr>
+        <w:t>() in Java ?</w:t>
       </w:r>
     </w:p>
     <w:p>

</xml_diff>